<commit_message>
Add use case description and diagram for AI Chatbot Portal
- Created use-case-description.md detailing 21 use cases for the AI Chatbot Portal, including flows, preconditions, and postconditions for both citizens and staff.
- Added use-case-diagram.md to visually represent the interactions between actors (citizens, staff, AI system, and government agencies) and the system, highlighting include and extend relationships among use cases.
</commit_message>
<xml_diff>
--- a/โครงงาน/02 ใบรับรองโครงงาน.docx
+++ b/โครงงาน/02 ใบรับรองโครงงาน.docx
@@ -311,7 +311,22 @@
                 <w:szCs w:val="32"/>
                 <w:cs/>
               </w:rPr>
-              <w:t>ผศ.สุริยนต์ สาระมูล)</w:t>
+              <w:t>ผู้ช่วยศาสตราจารย์</w:t>
+            </w:r>
+            <w:r>
+              <w:rPr>
+                <w:rFonts w:cs="TH Sarabun New"/>
+                <w:szCs w:val="32"/>
+              </w:rPr>
+              <w:t xml:space="preserve"> </w:t>
+            </w:r>
+            <w:r>
+              <w:rPr>
+                <w:rFonts w:cs="TH Sarabun New"/>
+                <w:szCs w:val="32"/>
+                <w:cs/>
+              </w:rPr>
+              <w:t>สุริยนต์ สาระมูล)</w:t>
             </w:r>
           </w:p>
           <w:p>
@@ -370,7 +385,30 @@
                 <w:szCs w:val="32"/>
                 <w:cs/>
               </w:rPr>
-              <w:t>(ผศ.ดร.ธิติพร ชาญศิริวัฒน์)</w:t>
+              <w:t>(</w:t>
+            </w:r>
+            <w:r>
+              <w:rPr>
+                <w:rFonts w:cs="TH Sarabun New"/>
+                <w:szCs w:val="32"/>
+                <w:cs/>
+              </w:rPr>
+              <w:t>ผู้ช่วยศาสตราจารย์</w:t>
+            </w:r>
+            <w:r>
+              <w:rPr>
+                <w:rFonts w:cs="TH Sarabun New"/>
+                <w:szCs w:val="32"/>
+              </w:rPr>
+              <w:t xml:space="preserve"> </w:t>
+            </w:r>
+            <w:r>
+              <w:rPr>
+                <w:rFonts w:cs="TH Sarabun New"/>
+                <w:szCs w:val="32"/>
+                <w:cs/>
+              </w:rPr>
+              <w:t>ธิติพร ชาญศิริวัฒน์)</w:t>
             </w:r>
           </w:p>
           <w:p>
@@ -448,7 +486,23 @@
                 <w:szCs w:val="32"/>
                 <w:cs/>
               </w:rPr>
-              <w:t>อ.ธนรัฐ โชติพันธ์)</w:t>
+              <w:t>อาจารย์</w:t>
+            </w:r>
+            <w:r>
+              <w:rPr>
+                <w:rFonts w:cs="TH Sarabun New" w:hint="cs"/>
+                <w:szCs w:val="32"/>
+                <w:cs/>
+              </w:rPr>
+              <w:t xml:space="preserve"> </w:t>
+            </w:r>
+            <w:r>
+              <w:rPr>
+                <w:rFonts w:cs="TH Sarabun New"/>
+                <w:szCs w:val="32"/>
+                <w:cs/>
+              </w:rPr>
+              <w:t>ธนรัฐ โชติพันธ์)</w:t>
             </w:r>
           </w:p>
           <w:p>
@@ -517,7 +571,23 @@
                 <w:szCs w:val="32"/>
                 <w:cs/>
               </w:rPr>
-              <w:t>(อ.สันทนีย์ กิจเพิ่มเกียรติ)</w:t>
+              <w:t>(</w:t>
+            </w:r>
+            <w:r>
+              <w:rPr>
+                <w:rFonts w:cs="TH Sarabun New"/>
+                <w:szCs w:val="32"/>
+                <w:cs/>
+              </w:rPr>
+              <w:t xml:space="preserve">อาจารย์ </w:t>
+            </w:r>
+            <w:r>
+              <w:rPr>
+                <w:rFonts w:cs="TH Sarabun New"/>
+                <w:szCs w:val="32"/>
+                <w:cs/>
+              </w:rPr>
+              <w:t>สันทนีย์ กิจเพิ่มเกียรติ)</w:t>
             </w:r>
           </w:p>
           <w:p>
@@ -595,7 +665,15 @@
                 <w:szCs w:val="32"/>
                 <w:cs/>
               </w:rPr>
-              <w:t>อ.เสาวลักษณ์ ไทยกลาง)</w:t>
+              <w:t xml:space="preserve">อาจารย์ </w:t>
+            </w:r>
+            <w:r>
+              <w:rPr>
+                <w:rFonts w:cs="TH Sarabun New"/>
+                <w:szCs w:val="32"/>
+                <w:cs/>
+              </w:rPr>
+              <w:t>เสาวลักษณ์ ไทยกลาง)</w:t>
             </w:r>
           </w:p>
           <w:p>
@@ -664,7 +742,23 @@
                 <w:szCs w:val="32"/>
                 <w:cs/>
               </w:rPr>
-              <w:t>(อ.ชัยวิชิต แก้วกลม)</w:t>
+              <w:t>(</w:t>
+            </w:r>
+            <w:r>
+              <w:rPr>
+                <w:rFonts w:cs="TH Sarabun New"/>
+                <w:szCs w:val="32"/>
+                <w:cs/>
+              </w:rPr>
+              <w:t xml:space="preserve">อาจารย์ </w:t>
+            </w:r>
+            <w:r>
+              <w:rPr>
+                <w:rFonts w:cs="TH Sarabun New"/>
+                <w:szCs w:val="32"/>
+                <w:cs/>
+              </w:rPr>
+              <w:t>ชัยวิชิต แก้วกลม)</w:t>
             </w:r>
           </w:p>
           <w:p>
@@ -791,7 +885,15 @@
           <w:szCs w:val="32"/>
           <w:cs/>
         </w:rPr>
-        <w:t>อ.)</w:t>
+        <w:t>ผู้ช่วยศาสตราจารย์ สุริยนต์ สาระมูล</w:t>
+      </w:r>
+      <w:r>
+        <w:rPr>
+          <w:rFonts w:cs="TH Sarabun New"/>
+          <w:szCs w:val="32"/>
+          <w:cs/>
+        </w:rPr>
+        <w:t>)</w:t>
       </w:r>
     </w:p>
     <w:p>

</xml_diff>